<commit_message>
Rebuild software feature table from the ARC-53 PDF wording.
Pull software-only requirements from the scanned technical annex (GCS, flight control, datalink, MISB metadata, geo-track, simulator). Tag requester as Latvia; Mexico is not in the PDF.

Co-authored-by: igal colugo-sys <igal-colugo@users.noreply.github.com>
</commit_message>
<xml_diff>
--- a/docs/software-features-requested-by.docx
+++ b/docs/software-features-requested-by.docx
@@ -4,8 +4,7 @@
   <w:body>
     <w:p>
       <w:pPr>
-        <w:spacing w:after="160"/>
-        <w:jc w:val="left"/>
+        <w:spacing w:after="120"/>
       </w:pPr>
       <w:r>
         <w:rPr>
@@ -19,7 +18,7 @@
     </w:p>
     <w:p>
       <w:pPr>
-        <w:spacing w:after="80"/>
+        <w:spacing w:after="60" w:before="0"/>
       </w:pPr>
       <w:r>
         <w:rPr>
@@ -34,15 +33,16 @@
           <w:rFonts w:ascii="Calibri" w:hAnsi="Calibri"/>
           <w:sz w:val="20"/>
         </w:rPr>
-        <w:t>Hybrid ARC-53 Technical Offer (Annex 1 to the Agreement, December 2025). Delivery and training are for the Latvia State Border Guard (Valsts robežsardze), Lidlauks, Runtorta, Isnaudas parish, Ludza municipality, LV-5701.</w:t>
+        <w:t>Extracted from Hybrid ARC-53 Technical Offer PDF (Annex 1, 4 pages). Buyer: Latvia State Border Guard. Delivery: Lidlauks, Runtorta, Isnaudas parish, Ludza municipality, LV-5701.</w:t>
       </w:r>
     </w:p>
     <w:p>
       <w:pPr>
-        <w:spacing w:after="240"/>
+        <w:spacing w:after="60" w:before="0"/>
       </w:pPr>
       <w:r>
         <w:rPr>
+          <w:rFonts w:ascii="Calibri" w:hAnsi="Calibri"/>
           <w:b/>
           <w:sz w:val="20"/>
         </w:rPr>
@@ -50,10 +50,36 @@
       </w:r>
       <w:r>
         <w:rPr>
+          <w:rFonts w:ascii="Calibri" w:hAnsi="Calibri"/>
           <w:sz w:val="20"/>
         </w:rPr>
-        <w:t>Software-relevant items only. Hardware, logistics, spare parts, optical/sensor hardware specs, airframe limits, and commercial terms are excluded. Mexico is not named in the uploaded annex, so every row is tagged Latvia.</w:t>
+        <w:t>Software-relevant items only — GCS, flight control, datalink, MISB metadata, payload video/geo-track software, simulator. Hardware, airframe limits, spare parts, delivery, and commercial terms excluded.</w:t>
       </w:r>
+    </w:p>
+    <w:p>
+      <w:pPr>
+        <w:spacing w:after="60" w:before="0"/>
+      </w:pPr>
+      <w:r>
+        <w:rPr>
+          <w:rFonts w:ascii="Calibri" w:hAnsi="Calibri"/>
+          <w:b/>
+          <w:sz w:val="20"/>
+        </w:rPr>
+        <w:t xml:space="preserve">Requested by: </w:t>
+      </w:r>
+      <w:r>
+        <w:rPr>
+          <w:rFonts w:ascii="Calibri" w:hAnsi="Calibri"/>
+          <w:sz w:val="20"/>
+        </w:rPr>
+        <w:t>Mexico is not named in this PDF. Every row is Latvia.</w:t>
+      </w:r>
+    </w:p>
+    <w:p>
+      <w:pPr>
+        <w:spacing w:after="160"/>
+      </w:pPr>
     </w:p>
     <w:tbl>
       <w:tblPr>
@@ -64,7 +90,8 @@
         <w:tblLook w:firstColumn="1" w:firstRow="1" w:lastColumn="0" w:lastRow="0" w:noHBand="0" w:noVBand="1" w:val="04A0"/>
       </w:tblPr>
       <w:tblGrid>
-        <w:gridCol w:w="8164"/>
+        <w:gridCol w:w="907"/>
+        <w:gridCol w:w="7710"/>
         <w:gridCol w:w="1701"/>
       </w:tblGrid>
       <w:tr>
@@ -73,13 +100,36 @@
         </w:trPr>
         <w:tc>
           <w:tcPr>
-            <w:tcW w:type="dxa" w:w="4933"/>
+            <w:tcW w:type="dxa" w:w="907"/>
             <w:vAlign w:val="center"/>
             <w:shd w:fill="1F4E79" w:val="clear"/>
           </w:tcPr>
           <w:p>
             <w:pPr>
-              <w:spacing w:before="60" w:after="60"/>
+              <w:spacing w:before="40" w:after="40"/>
+              <w:jc w:val="center"/>
+            </w:pPr>
+            <w:r/>
+            <w:r>
+              <w:rPr>
+                <w:rFonts w:ascii="Calibri" w:hAnsi="Calibri"/>
+                <w:b/>
+                <w:color w:val="FFFFFF"/>
+                <w:sz w:val="22"/>
+              </w:rPr>
+              <w:t>PDF</w:t>
+            </w:r>
+          </w:p>
+        </w:tc>
+        <w:tc>
+          <w:tcPr>
+            <w:tcW w:type="dxa" w:w="7710"/>
+            <w:vAlign w:val="center"/>
+            <w:shd w:fill="1F4E79" w:val="clear"/>
+          </w:tcPr>
+          <w:p>
+            <w:pPr>
+              <w:spacing w:before="40" w:after="40"/>
             </w:pPr>
             <w:r/>
             <w:r>
@@ -95,13 +145,13 @@
         </w:tc>
         <w:tc>
           <w:tcPr>
-            <w:tcW w:type="dxa" w:w="4933"/>
+            <w:tcW w:type="dxa" w:w="1701"/>
             <w:vAlign w:val="center"/>
             <w:shd w:fill="1F4E79" w:val="clear"/>
           </w:tcPr>
           <w:p>
             <w:pPr>
-              <w:spacing w:before="60" w:after="60"/>
+              <w:spacing w:before="40" w:after="40"/>
               <w:jc w:val="center"/>
             </w:pPr>
             <w:r/>
@@ -120,12 +170,33 @@
       <w:tr>
         <w:tc>
           <w:tcPr>
-            <w:tcW w:type="dxa" w:w="8164"/>
+            <w:tcW w:type="dxa" w:w="907"/>
             <w:vAlign w:val="center"/>
           </w:tcPr>
           <w:p>
             <w:pPr>
-              <w:spacing w:before="60" w:after="60"/>
+              <w:spacing w:before="40" w:after="40"/>
+              <w:jc w:val="center"/>
+            </w:pPr>
+            <w:r/>
+            <w:r>
+              <w:rPr>
+                <w:rFonts w:ascii="Calibri" w:hAnsi="Calibri"/>
+                <w:b w:val="0"/>
+                <w:sz w:val="18"/>
+              </w:rPr>
+              <w:t>§1</w:t>
+            </w:r>
+          </w:p>
+        </w:tc>
+        <w:tc>
+          <w:tcPr>
+            <w:tcW w:type="dxa" w:w="7710"/>
+            <w:vAlign w:val="center"/>
+          </w:tcPr>
+          <w:p>
+            <w:pPr>
+              <w:spacing w:before="40" w:after="40"/>
             </w:pPr>
             <w:r/>
             <w:r>
@@ -134,7 +205,7 @@
                 <w:b w:val="0"/>
                 <w:sz w:val="20"/>
               </w:rPr>
-              <w:t>HD video downlink (visible + IR) with long-range visual control, day and night</w:t>
+              <w:t>HD quality video signal transmission up to a radius of 100 km (at direct radio visibility).</w:t>
             </w:r>
           </w:p>
         </w:tc>
@@ -145,7 +216,7 @@
           </w:tcPr>
           <w:p>
             <w:pPr>
-              <w:spacing w:before="60" w:after="60"/>
+              <w:spacing w:before="40" w:after="40"/>
               <w:jc w:val="center"/>
             </w:pPr>
             <w:r/>
@@ -163,13 +234,35 @@
       <w:tr>
         <w:tc>
           <w:tcPr>
-            <w:tcW w:type="dxa" w:w="8164"/>
+            <w:tcW w:type="dxa" w:w="907"/>
             <w:vAlign w:val="center"/>
             <w:shd w:fill="D6E3F0" w:val="clear"/>
           </w:tcPr>
           <w:p>
             <w:pPr>
-              <w:spacing w:before="60" w:after="60"/>
+              <w:spacing w:before="40" w:after="40"/>
+              <w:jc w:val="center"/>
+            </w:pPr>
+            <w:r/>
+            <w:r>
+              <w:rPr>
+                <w:rFonts w:ascii="Calibri" w:hAnsi="Calibri"/>
+                <w:b w:val="0"/>
+                <w:sz w:val="18"/>
+              </w:rPr>
+              <w:t>§1</w:t>
+            </w:r>
+          </w:p>
+        </w:tc>
+        <w:tc>
+          <w:tcPr>
+            <w:tcW w:type="dxa" w:w="7710"/>
+            <w:vAlign w:val="center"/>
+            <w:shd w:fill="D6E3F0" w:val="clear"/>
+          </w:tcPr>
+          <w:p>
+            <w:pPr>
+              <w:spacing w:before="40" w:after="40"/>
             </w:pPr>
             <w:r/>
             <w:r>
@@ -178,7 +271,7 @@
                 <w:b w:val="0"/>
                 <w:sz w:val="20"/>
               </w:rPr>
-              <w:t>Data terminal in 4,400–4,940 MHz; RF power configurable to support ≥80 km (offered 100 km)</w:t>
+              <w:t>Transmission and reception of information about the subject and objects in visible light and infrared radiation, as video and images.</w:t>
             </w:r>
           </w:p>
         </w:tc>
@@ -190,7 +283,7 @@
           </w:tcPr>
           <w:p>
             <w:pPr>
-              <w:spacing w:before="60" w:after="60"/>
+              <w:spacing w:before="40" w:after="40"/>
               <w:jc w:val="center"/>
             </w:pPr>
             <w:r/>
@@ -208,12 +301,33 @@
       <w:tr>
         <w:tc>
           <w:tcPr>
-            <w:tcW w:type="dxa" w:w="8164"/>
+            <w:tcW w:type="dxa" w:w="907"/>
             <w:vAlign w:val="center"/>
           </w:tcPr>
           <w:p>
             <w:pPr>
-              <w:spacing w:before="60" w:after="60"/>
+              <w:spacing w:before="40" w:after="40"/>
+              <w:jc w:val="center"/>
+            </w:pPr>
+            <w:r/>
+            <w:r>
+              <w:rPr>
+                <w:rFonts w:ascii="Calibri" w:hAnsi="Calibri"/>
+                <w:b w:val="0"/>
+                <w:sz w:val="18"/>
+              </w:rPr>
+              <w:t>§1</w:t>
+            </w:r>
+          </w:p>
+        </w:tc>
+        <w:tc>
+          <w:tcPr>
+            <w:tcW w:type="dxa" w:w="7710"/>
+            <w:vAlign w:val="center"/>
+          </w:tcPr>
+          <w:p>
+            <w:pPr>
+              <w:spacing w:before="40" w:after="40"/>
             </w:pPr>
             <w:r/>
             <w:r>
@@ -222,7 +336,7 @@
                 <w:b w:val="0"/>
                 <w:sz w:val="20"/>
               </w:rPr>
-              <w:t>Ground Control Station (GCS) with portable flight-path tracking antenna</w:t>
+              <w:t>Appropriate adjustments can be made to the system; other types of payload elements can be installed for other long-term airborne tasks.</w:t>
             </w:r>
           </w:p>
         </w:tc>
@@ -233,7 +347,7 @@
           </w:tcPr>
           <w:p>
             <w:pPr>
-              <w:spacing w:before="60" w:after="60"/>
+              <w:spacing w:before="40" w:after="40"/>
               <w:jc w:val="center"/>
             </w:pPr>
             <w:r/>
@@ -251,13 +365,35 @@
       <w:tr>
         <w:tc>
           <w:tcPr>
-            <w:tcW w:type="dxa" w:w="8164"/>
+            <w:tcW w:type="dxa" w:w="907"/>
             <w:vAlign w:val="center"/>
             <w:shd w:fill="D6E3F0" w:val="clear"/>
           </w:tcPr>
           <w:p>
             <w:pPr>
-              <w:spacing w:before="60" w:after="60"/>
+              <w:spacing w:before="40" w:after="40"/>
+              <w:jc w:val="center"/>
+            </w:pPr>
+            <w:r/>
+            <w:r>
+              <w:rPr>
+                <w:rFonts w:ascii="Calibri" w:hAnsi="Calibri"/>
+                <w:b w:val="0"/>
+                <w:sz w:val="18"/>
+              </w:rPr>
+              <w:t>§1</w:t>
+            </w:r>
+          </w:p>
+        </w:tc>
+        <w:tc>
+          <w:tcPr>
+            <w:tcW w:type="dxa" w:w="7710"/>
+            <w:vAlign w:val="center"/>
+            <w:shd w:fill="D6E3F0" w:val="clear"/>
+          </w:tcPr>
+          <w:p>
+            <w:pPr>
+              <w:spacing w:before="40" w:after="40"/>
             </w:pPr>
             <w:r/>
             <w:r>
@@ -266,7 +402,7 @@
                 <w:b w:val="0"/>
                 <w:sz w:val="20"/>
               </w:rPr>
-              <w:t>GCS usable on SBG vehicle or ship for SBG, FRONTEX, and other state/local tasks</w:t>
+              <w:t>Ground Control Station (GCS) with portable flight path tracking antenna system.</w:t>
             </w:r>
           </w:p>
         </w:tc>
@@ -278,7 +414,7 @@
           </w:tcPr>
           <w:p>
             <w:pPr>
-              <w:spacing w:before="60" w:after="60"/>
+              <w:spacing w:before="40" w:after="40"/>
               <w:jc w:val="center"/>
             </w:pPr>
             <w:r/>
@@ -296,12 +432,33 @@
       <w:tr>
         <w:tc>
           <w:tcPr>
-            <w:tcW w:type="dxa" w:w="8164"/>
+            <w:tcW w:type="dxa" w:w="907"/>
             <w:vAlign w:val="center"/>
           </w:tcPr>
           <w:p>
             <w:pPr>
-              <w:spacing w:before="60" w:after="60"/>
+              <w:spacing w:before="40" w:after="40"/>
+              <w:jc w:val="center"/>
+            </w:pPr>
+            <w:r/>
+            <w:r>
+              <w:rPr>
+                <w:rFonts w:ascii="Calibri" w:hAnsi="Calibri"/>
+                <w:b w:val="0"/>
+                <w:sz w:val="18"/>
+              </w:rPr>
+              <w:t>§1</w:t>
+            </w:r>
+          </w:p>
+        </w:tc>
+        <w:tc>
+          <w:tcPr>
+            <w:tcW w:type="dxa" w:w="7710"/>
+            <w:vAlign w:val="center"/>
+          </w:tcPr>
+          <w:p>
+            <w:pPr>
+              <w:spacing w:before="40" w:after="40"/>
             </w:pPr>
             <w:r/>
             <w:r>
@@ -310,7 +467,7 @@
                 <w:b w:val="0"/>
                 <w:sz w:val="20"/>
               </w:rPr>
-              <w:t>Aircraft hand-over between GCS units</w:t>
+              <w:t>Training on the unmanned aircraft system (system and/or simulator).</w:t>
             </w:r>
           </w:p>
         </w:tc>
@@ -321,7 +478,7 @@
           </w:tcPr>
           <w:p>
             <w:pPr>
-              <w:spacing w:before="60" w:after="60"/>
+              <w:spacing w:before="40" w:after="40"/>
               <w:jc w:val="center"/>
             </w:pPr>
             <w:r/>
@@ -339,13 +496,35 @@
       <w:tr>
         <w:tc>
           <w:tcPr>
-            <w:tcW w:type="dxa" w:w="8164"/>
+            <w:tcW w:type="dxa" w:w="907"/>
             <w:vAlign w:val="center"/>
             <w:shd w:fill="D6E3F0" w:val="clear"/>
           </w:tcPr>
           <w:p>
             <w:pPr>
-              <w:spacing w:before="60" w:after="60"/>
+              <w:spacing w:before="40" w:after="40"/>
+              <w:jc w:val="center"/>
+            </w:pPr>
+            <w:r/>
+            <w:r>
+              <w:rPr>
+                <w:rFonts w:ascii="Calibri" w:hAnsi="Calibri"/>
+                <w:b w:val="0"/>
+                <w:sz w:val="18"/>
+              </w:rPr>
+              <w:t>§2</w:t>
+            </w:r>
+          </w:p>
+        </w:tc>
+        <w:tc>
+          <w:tcPr>
+            <w:tcW w:type="dxa" w:w="7710"/>
+            <w:vAlign w:val="center"/>
+            <w:shd w:fill="D6E3F0" w:val="clear"/>
+          </w:tcPr>
+          <w:p>
+            <w:pPr>
+              <w:spacing w:before="40" w:after="40"/>
             </w:pPr>
             <w:r/>
             <w:r>
@@ -354,7 +533,7 @@
                 <w:b w:val="0"/>
                 <w:sz w:val="20"/>
               </w:rPr>
-              <w:t>Deploy and operate control and communication elements during flight</w:t>
+              <w:t>Data terminal operating frequency band 4,400–4,940 MHz.</w:t>
             </w:r>
           </w:p>
         </w:tc>
@@ -366,7 +545,7 @@
           </w:tcPr>
           <w:p>
             <w:pPr>
-              <w:spacing w:before="60" w:after="60"/>
+              <w:spacing w:before="40" w:after="40"/>
               <w:jc w:val="center"/>
             </w:pPr>
             <w:r/>
@@ -384,12 +563,33 @@
       <w:tr>
         <w:tc>
           <w:tcPr>
-            <w:tcW w:type="dxa" w:w="8164"/>
+            <w:tcW w:type="dxa" w:w="907"/>
             <w:vAlign w:val="center"/>
           </w:tcPr>
           <w:p>
             <w:pPr>
-              <w:spacing w:before="60" w:after="60"/>
+              <w:spacing w:before="40" w:after="40"/>
+              <w:jc w:val="center"/>
+            </w:pPr>
+            <w:r/>
+            <w:r>
+              <w:rPr>
+                <w:rFonts w:ascii="Calibri" w:hAnsi="Calibri"/>
+                <w:b w:val="0"/>
+                <w:sz w:val="18"/>
+              </w:rPr>
+              <w:t>§2</w:t>
+            </w:r>
+          </w:p>
+        </w:tc>
+        <w:tc>
+          <w:tcPr>
+            <w:tcW w:type="dxa" w:w="7710"/>
+            <w:vAlign w:val="center"/>
+          </w:tcPr>
+          <w:p>
+            <w:pPr>
+              <w:spacing w:before="40" w:after="40"/>
             </w:pPr>
             <w:r/>
             <w:r>
@@ -398,7 +598,7 @@
                 <w:b w:val="0"/>
                 <w:sz w:val="20"/>
               </w:rPr>
-              <w:t>Fully automatic flight from take-off to landing</w:t>
+              <w:t>Output power sufficient for operating distance not less than 80 km, with the possibility to be set at different limit values as necessary.</w:t>
             </w:r>
           </w:p>
         </w:tc>
@@ -409,7 +609,7 @@
           </w:tcPr>
           <w:p>
             <w:pPr>
-              <w:spacing w:before="60" w:after="60"/>
+              <w:spacing w:before="40" w:after="40"/>
               <w:jc w:val="center"/>
             </w:pPr>
             <w:r/>
@@ -427,13 +627,35 @@
       <w:tr>
         <w:tc>
           <w:tcPr>
-            <w:tcW w:type="dxa" w:w="8164"/>
+            <w:tcW w:type="dxa" w:w="907"/>
             <w:vAlign w:val="center"/>
             <w:shd w:fill="D6E3F0" w:val="clear"/>
           </w:tcPr>
           <w:p>
             <w:pPr>
-              <w:spacing w:before="60" w:after="60"/>
+              <w:spacing w:before="40" w:after="40"/>
+              <w:jc w:val="center"/>
+            </w:pPr>
+            <w:r/>
+            <w:r>
+              <w:rPr>
+                <w:rFonts w:ascii="Calibri" w:hAnsi="Calibri"/>
+                <w:b w:val="0"/>
+                <w:sz w:val="18"/>
+              </w:rPr>
+              <w:t>§2</w:t>
+            </w:r>
+          </w:p>
+        </w:tc>
+        <w:tc>
+          <w:tcPr>
+            <w:tcW w:type="dxa" w:w="7710"/>
+            <w:vAlign w:val="center"/>
+            <w:shd w:fill="D6E3F0" w:val="clear"/>
+          </w:tcPr>
+          <w:p>
+            <w:pPr>
+              <w:spacing w:before="40" w:after="40"/>
             </w:pPr>
             <w:r/>
             <w:r>
@@ -442,7 +664,7 @@
                 <w:b w:val="0"/>
                 <w:sz w:val="20"/>
               </w:rPr>
-              <w:t>Take-off and landing on a moving object (e.g. ship)</w:t>
+              <w:t>Flight control system ensures fully automatic operation from take-off to landing.</w:t>
             </w:r>
           </w:p>
         </w:tc>
@@ -454,7 +676,7 @@
           </w:tcPr>
           <w:p>
             <w:pPr>
-              <w:spacing w:before="60" w:after="60"/>
+              <w:spacing w:before="40" w:after="40"/>
               <w:jc w:val="center"/>
             </w:pPr>
             <w:r/>
@@ -472,12 +694,33 @@
       <w:tr>
         <w:tc>
           <w:tcPr>
-            <w:tcW w:type="dxa" w:w="8164"/>
+            <w:tcW w:type="dxa" w:w="907"/>
             <w:vAlign w:val="center"/>
           </w:tcPr>
           <w:p>
             <w:pPr>
-              <w:spacing w:before="60" w:after="60"/>
+              <w:spacing w:before="40" w:after="40"/>
+              <w:jc w:val="center"/>
+            </w:pPr>
+            <w:r/>
+            <w:r>
+              <w:rPr>
+                <w:rFonts w:ascii="Calibri" w:hAnsi="Calibri"/>
+                <w:b w:val="0"/>
+                <w:sz w:val="18"/>
+              </w:rPr>
+              <w:t>§2</w:t>
+            </w:r>
+          </w:p>
+        </w:tc>
+        <w:tc>
+          <w:tcPr>
+            <w:tcW w:type="dxa" w:w="7710"/>
+            <w:vAlign w:val="center"/>
+          </w:tcPr>
+          <w:p>
+            <w:pPr>
+              <w:spacing w:before="40" w:after="40"/>
             </w:pPr>
             <w:r/>
             <w:r>
@@ -486,7 +729,7 @@
                 <w:b w:val="0"/>
                 <w:sz w:val="20"/>
               </w:rPr>
-              <w:t>Automatic route adjustment and return-to-base in GPS-denied / GPS-prohibited areas</w:t>
+              <w:t>Possibility of take-off and landing on a moving object (e.g. on ship).</w:t>
             </w:r>
           </w:p>
         </w:tc>
@@ -497,7 +740,7 @@
           </w:tcPr>
           <w:p>
             <w:pPr>
-              <w:spacing w:before="60" w:after="60"/>
+              <w:spacing w:before="40" w:after="40"/>
               <w:jc w:val="center"/>
             </w:pPr>
             <w:r/>
@@ -515,13 +758,35 @@
       <w:tr>
         <w:tc>
           <w:tcPr>
-            <w:tcW w:type="dxa" w:w="8164"/>
+            <w:tcW w:type="dxa" w:w="907"/>
             <w:vAlign w:val="center"/>
             <w:shd w:fill="D6E3F0" w:val="clear"/>
           </w:tcPr>
           <w:p>
             <w:pPr>
-              <w:spacing w:before="60" w:after="60"/>
+              <w:spacing w:before="40" w:after="40"/>
+              <w:jc w:val="center"/>
+            </w:pPr>
+            <w:r/>
+            <w:r>
+              <w:rPr>
+                <w:rFonts w:ascii="Calibri" w:hAnsi="Calibri"/>
+                <w:b w:val="0"/>
+                <w:sz w:val="18"/>
+              </w:rPr>
+              <w:t>§2</w:t>
+            </w:r>
+          </w:p>
+        </w:tc>
+        <w:tc>
+          <w:tcPr>
+            <w:tcW w:type="dxa" w:w="7710"/>
+            <w:vAlign w:val="center"/>
+            <w:shd w:fill="D6E3F0" w:val="clear"/>
+          </w:tcPr>
+          <w:p>
+            <w:pPr>
+              <w:spacing w:before="40" w:after="40"/>
             </w:pPr>
             <w:r/>
             <w:r>
@@ -530,7 +795,7 @@
                 <w:b w:val="0"/>
                 <w:sz w:val="20"/>
               </w:rPr>
-              <w:t>Precision landing at a marked location</w:t>
+              <w:t>Automatic route adjustment and return to base in GPS prohibited areas.</w:t>
             </w:r>
           </w:p>
         </w:tc>
@@ -542,7 +807,7 @@
           </w:tcPr>
           <w:p>
             <w:pPr>
-              <w:spacing w:before="60" w:after="60"/>
+              <w:spacing w:before="40" w:after="40"/>
               <w:jc w:val="center"/>
             </w:pPr>
             <w:r/>
@@ -560,12 +825,33 @@
       <w:tr>
         <w:tc>
           <w:tcPr>
-            <w:tcW w:type="dxa" w:w="8164"/>
+            <w:tcW w:type="dxa" w:w="907"/>
             <w:vAlign w:val="center"/>
           </w:tcPr>
           <w:p>
             <w:pPr>
-              <w:spacing w:before="60" w:after="60"/>
+              <w:spacing w:before="40" w:after="40"/>
+              <w:jc w:val="center"/>
+            </w:pPr>
+            <w:r/>
+            <w:r>
+              <w:rPr>
+                <w:rFonts w:ascii="Calibri" w:hAnsi="Calibri"/>
+                <w:b w:val="0"/>
+                <w:sz w:val="18"/>
+              </w:rPr>
+              <w:t>§2</w:t>
+            </w:r>
+          </w:p>
+        </w:tc>
+        <w:tc>
+          <w:tcPr>
+            <w:tcW w:type="dxa" w:w="7710"/>
+            <w:vAlign w:val="center"/>
+          </w:tcPr>
+          <w:p>
+            <w:pPr>
+              <w:spacing w:before="40" w:after="40"/>
             </w:pPr>
             <w:r/>
             <w:r>
@@ -574,7 +860,7 @@
                 <w:b w:val="0"/>
                 <w:sz w:val="20"/>
               </w:rPr>
-              <w:t>INS navigation; follow route or return to a specified location without GPS</w:t>
+              <w:t>Landing system provides landing of the aircraft at the marked location.</w:t>
             </w:r>
           </w:p>
         </w:tc>
@@ -585,7 +871,7 @@
           </w:tcPr>
           <w:p>
             <w:pPr>
-              <w:spacing w:before="60" w:after="60"/>
+              <w:spacing w:before="40" w:after="40"/>
               <w:jc w:val="center"/>
             </w:pPr>
             <w:r/>
@@ -603,13 +889,35 @@
       <w:tr>
         <w:tc>
           <w:tcPr>
-            <w:tcW w:type="dxa" w:w="8164"/>
+            <w:tcW w:type="dxa" w:w="907"/>
             <w:vAlign w:val="center"/>
             <w:shd w:fill="D6E3F0" w:val="clear"/>
           </w:tcPr>
           <w:p>
             <w:pPr>
-              <w:spacing w:before="60" w:after="60"/>
+              <w:spacing w:before="40" w:after="40"/>
+              <w:jc w:val="center"/>
+            </w:pPr>
+            <w:r/>
+            <w:r>
+              <w:rPr>
+                <w:rFonts w:ascii="Calibri" w:hAnsi="Calibri"/>
+                <w:b w:val="0"/>
+                <w:sz w:val="18"/>
+              </w:rPr>
+              <w:t>§2</w:t>
+            </w:r>
+          </w:p>
+        </w:tc>
+        <w:tc>
+          <w:tcPr>
+            <w:tcW w:type="dxa" w:w="7710"/>
+            <w:vAlign w:val="center"/>
+            <w:shd w:fill="D6E3F0" w:val="clear"/>
+          </w:tcPr>
+          <w:p>
+            <w:pPr>
+              <w:spacing w:before="40" w:after="40"/>
             </w:pPr>
             <w:r/>
             <w:r>
@@ -618,7 +926,7 @@
                 <w:b w:val="0"/>
                 <w:sz w:val="20"/>
               </w:rPr>
-              <w:t>Payload data-entry function for later analysis</w:t>
+              <w:t>Payload element data entry function for further analysis.</w:t>
             </w:r>
           </w:p>
         </w:tc>
@@ -630,7 +938,7 @@
           </w:tcPr>
           <w:p>
             <w:pPr>
-              <w:spacing w:before="60" w:after="60"/>
+              <w:spacing w:before="40" w:after="40"/>
               <w:jc w:val="center"/>
             </w:pPr>
             <w:r/>
@@ -648,12 +956,33 @@
       <w:tr>
         <w:tc>
           <w:tcPr>
-            <w:tcW w:type="dxa" w:w="8164"/>
+            <w:tcW w:type="dxa" w:w="907"/>
             <w:vAlign w:val="center"/>
           </w:tcPr>
           <w:p>
             <w:pPr>
-              <w:spacing w:before="60" w:after="60"/>
+              <w:spacing w:before="40" w:after="40"/>
+              <w:jc w:val="center"/>
+            </w:pPr>
+            <w:r/>
+            <w:r>
+              <w:rPr>
+                <w:rFonts w:ascii="Calibri" w:hAnsi="Calibri"/>
+                <w:b w:val="0"/>
+                <w:sz w:val="18"/>
+              </w:rPr>
+              <w:t>§2</w:t>
+            </w:r>
+          </w:p>
+        </w:tc>
+        <w:tc>
+          <w:tcPr>
+            <w:tcW w:type="dxa" w:w="7710"/>
+            <w:vAlign w:val="center"/>
+          </w:tcPr>
+          <w:p>
+            <w:pPr>
+              <w:spacing w:before="40" w:after="40"/>
             </w:pPr>
             <w:r/>
             <w:r>
@@ -662,7 +991,7 @@
                 <w:b w:val="0"/>
                 <w:sz w:val="20"/>
               </w:rPr>
-              <w:t>Video metadata per MISB STD 0601 “UAS Data Link Local Metadata Set”</w:t>
+              <w:t>Video signal metadata configured according to MISB STD 0601 “UAS Data Link Local Metadata Set”.</w:t>
             </w:r>
           </w:p>
         </w:tc>
@@ -673,7 +1002,7 @@
           </w:tcPr>
           <w:p>
             <w:pPr>
-              <w:spacing w:before="60" w:after="60"/>
+              <w:spacing w:before="40" w:after="40"/>
               <w:jc w:val="center"/>
             </w:pPr>
             <w:r/>
@@ -691,13 +1020,35 @@
       <w:tr>
         <w:tc>
           <w:tcPr>
-            <w:tcW w:type="dxa" w:w="8164"/>
+            <w:tcW w:type="dxa" w:w="907"/>
             <w:vAlign w:val="center"/>
             <w:shd w:fill="D6E3F0" w:val="clear"/>
           </w:tcPr>
           <w:p>
             <w:pPr>
-              <w:spacing w:before="60" w:after="60"/>
+              <w:spacing w:before="40" w:after="40"/>
+              <w:jc w:val="center"/>
+            </w:pPr>
+            <w:r/>
+            <w:r>
+              <w:rPr>
+                <w:rFonts w:ascii="Calibri" w:hAnsi="Calibri"/>
+                <w:b w:val="0"/>
+                <w:sz w:val="18"/>
+              </w:rPr>
+              <w:t>§2</w:t>
+            </w:r>
+          </w:p>
+        </w:tc>
+        <w:tc>
+          <w:tcPr>
+            <w:tcW w:type="dxa" w:w="7710"/>
+            <w:vAlign w:val="center"/>
+            <w:shd w:fill="D6E3F0" w:val="clear"/>
+          </w:tcPr>
+          <w:p>
+            <w:pPr>
+              <w:spacing w:before="40" w:after="40"/>
             </w:pPr>
             <w:r/>
             <w:r>
@@ -706,7 +1057,7 @@
                 <w:b w:val="0"/>
                 <w:sz w:val="20"/>
               </w:rPr>
-              <w:t>Payload display metadata per MISB STD 0902.8 “Motion Imagery Sensor Minimum Metadata Set”</w:t>
+              <w:t>Payload element information display shall display at least the minimum amount of metadata specified in MISB STD 0902.8 “Motion Imagery Sensor Minimum Metadata Set”.</w:t>
             </w:r>
           </w:p>
         </w:tc>
@@ -718,7 +1069,7 @@
           </w:tcPr>
           <w:p>
             <w:pPr>
-              <w:spacing w:before="60" w:after="60"/>
+              <w:spacing w:before="40" w:after="40"/>
               <w:jc w:val="center"/>
             </w:pPr>
             <w:r/>
@@ -736,12 +1087,33 @@
       <w:tr>
         <w:tc>
           <w:tcPr>
-            <w:tcW w:type="dxa" w:w="8164"/>
+            <w:tcW w:type="dxa" w:w="907"/>
             <w:vAlign w:val="center"/>
           </w:tcPr>
           <w:p>
             <w:pPr>
-              <w:spacing w:before="60" w:after="60"/>
+              <w:spacing w:before="40" w:after="40"/>
+              <w:jc w:val="center"/>
+            </w:pPr>
+            <w:r/>
+            <w:r>
+              <w:rPr>
+                <w:rFonts w:ascii="Calibri" w:hAnsi="Calibri"/>
+                <w:b w:val="0"/>
+                <w:sz w:val="18"/>
+              </w:rPr>
+              <w:t>§2</w:t>
+            </w:r>
+          </w:p>
+        </w:tc>
+        <w:tc>
+          <w:tcPr>
+            <w:tcW w:type="dxa" w:w="7710"/>
+            <w:vAlign w:val="center"/>
+          </w:tcPr>
+          <w:p>
+            <w:pPr>
+              <w:spacing w:before="40" w:after="40"/>
             </w:pPr>
             <w:r/>
             <w:r>
@@ -750,7 +1122,7 @@
                 <w:b w:val="0"/>
                 <w:sz w:val="20"/>
               </w:rPr>
-              <w:t>Configure metadata; strip metadata from imagery when required</w:t>
+              <w:t>Possibility to configure metadata and remove metadata from the image upon necessity.</w:t>
             </w:r>
           </w:p>
         </w:tc>
@@ -761,7 +1133,7 @@
           </w:tcPr>
           <w:p>
             <w:pPr>
-              <w:spacing w:before="60" w:after="60"/>
+              <w:spacing w:before="40" w:after="40"/>
               <w:jc w:val="center"/>
             </w:pPr>
             <w:r/>
@@ -779,13 +1151,35 @@
       <w:tr>
         <w:tc>
           <w:tcPr>
-            <w:tcW w:type="dxa" w:w="8164"/>
+            <w:tcW w:type="dxa" w:w="907"/>
             <w:vAlign w:val="center"/>
             <w:shd w:fill="D6E3F0" w:val="clear"/>
           </w:tcPr>
           <w:p>
             <w:pPr>
-              <w:spacing w:before="60" w:after="60"/>
+              <w:spacing w:before="40" w:after="40"/>
+              <w:jc w:val="center"/>
+            </w:pPr>
+            <w:r/>
+            <w:r>
+              <w:rPr>
+                <w:rFonts w:ascii="Calibri" w:hAnsi="Calibri"/>
+                <w:b w:val="0"/>
+                <w:sz w:val="18"/>
+              </w:rPr>
+              <w:t>§2</w:t>
+            </w:r>
+          </w:p>
+        </w:tc>
+        <w:tc>
+          <w:tcPr>
+            <w:tcW w:type="dxa" w:w="7710"/>
+            <w:vAlign w:val="center"/>
+            <w:shd w:fill="D6E3F0" w:val="clear"/>
+          </w:tcPr>
+          <w:p>
+            <w:pPr>
+              <w:spacing w:before="40" w:after="40"/>
             </w:pPr>
             <w:r/>
             <w:r>
@@ -794,7 +1188,7 @@
                 <w:b w:val="0"/>
                 <w:sz w:val="20"/>
               </w:rPr>
-              <w:t>Video recording for all installed sensors; retain geo-point of each completed mission</w:t>
+              <w:t>Aircraft equipped with a navigation system (e.g. INS). Aircraft able to operate without GPS (follow the set route or return to the specified location).</w:t>
             </w:r>
           </w:p>
         </w:tc>
@@ -806,7 +1200,7 @@
           </w:tcPr>
           <w:p>
             <w:pPr>
-              <w:spacing w:before="60" w:after="60"/>
+              <w:spacing w:before="40" w:after="40"/>
               <w:jc w:val="center"/>
             </w:pPr>
             <w:r/>
@@ -824,12 +1218,33 @@
       <w:tr>
         <w:tc>
           <w:tcPr>
-            <w:tcW w:type="dxa" w:w="8164"/>
+            <w:tcW w:type="dxa" w:w="907"/>
             <w:vAlign w:val="center"/>
           </w:tcPr>
           <w:p>
             <w:pPr>
-              <w:spacing w:before="60" w:after="60"/>
+              <w:spacing w:before="40" w:after="40"/>
+              <w:jc w:val="center"/>
+            </w:pPr>
+            <w:r/>
+            <w:r>
+              <w:rPr>
+                <w:rFonts w:ascii="Calibri" w:hAnsi="Calibri"/>
+                <w:b w:val="0"/>
+                <w:sz w:val="18"/>
+              </w:rPr>
+              <w:t>§2</w:t>
+            </w:r>
+          </w:p>
+        </w:tc>
+        <w:tc>
+          <w:tcPr>
+            <w:tcW w:type="dxa" w:w="7710"/>
+            <w:vAlign w:val="center"/>
+          </w:tcPr>
+          <w:p>
+            <w:pPr>
+              <w:spacing w:before="40" w:after="40"/>
             </w:pPr>
             <w:r/>
             <w:r>
@@ -838,7 +1253,7 @@
                 <w:b w:val="0"/>
                 <w:sz w:val="20"/>
               </w:rPr>
-              <w:t>EO/IR geo-track: display observed-target coordinates</w:t>
+              <w:t>ADS-B technology transponder or equivalent flight identification device (≤ 0.1 kg). Flight identification device shall be unlockable.</w:t>
             </w:r>
           </w:p>
         </w:tc>
@@ -849,7 +1264,7 @@
           </w:tcPr>
           <w:p>
             <w:pPr>
-              <w:spacing w:before="60" w:after="60"/>
+              <w:spacing w:before="40" w:after="40"/>
               <w:jc w:val="center"/>
             </w:pPr>
             <w:r/>
@@ -867,13 +1282,35 @@
       <w:tr>
         <w:tc>
           <w:tcPr>
-            <w:tcW w:type="dxa" w:w="8164"/>
+            <w:tcW w:type="dxa" w:w="907"/>
             <w:vAlign w:val="center"/>
             <w:shd w:fill="D6E3F0" w:val="clear"/>
           </w:tcPr>
           <w:p>
             <w:pPr>
-              <w:spacing w:before="60" w:after="60"/>
+              <w:spacing w:before="40" w:after="40"/>
+              <w:jc w:val="center"/>
+            </w:pPr>
+            <w:r/>
+            <w:r>
+              <w:rPr>
+                <w:rFonts w:ascii="Calibri" w:hAnsi="Calibri"/>
+                <w:b w:val="0"/>
+                <w:sz w:val="18"/>
+              </w:rPr>
+              <w:t>§3</w:t>
+            </w:r>
+          </w:p>
+        </w:tc>
+        <w:tc>
+          <w:tcPr>
+            <w:tcW w:type="dxa" w:w="7710"/>
+            <w:vAlign w:val="center"/>
+            <w:shd w:fill="D6E3F0" w:val="clear"/>
+          </w:tcPr>
+          <w:p>
+            <w:pPr>
+              <w:spacing w:before="40" w:after="40"/>
             </w:pPr>
             <w:r/>
             <w:r>
@@ -882,7 +1319,7 @@
                 <w:b w:val="0"/>
                 <w:sz w:val="20"/>
               </w:rPr>
-              <w:t>Distance gauge as part of geo-point; geo-track range to observed target</w:t>
+              <w:t>Payload intended for identification and documentation during day and night.</w:t>
             </w:r>
           </w:p>
         </w:tc>
@@ -894,7 +1331,7 @@
           </w:tcPr>
           <w:p>
             <w:pPr>
-              <w:spacing w:before="60" w:after="60"/>
+              <w:spacing w:before="40" w:after="40"/>
               <w:jc w:val="center"/>
             </w:pPr>
             <w:r/>
@@ -912,12 +1349,33 @@
       <w:tr>
         <w:tc>
           <w:tcPr>
-            <w:tcW w:type="dxa" w:w="8164"/>
+            <w:tcW w:type="dxa" w:w="907"/>
             <w:vAlign w:val="center"/>
           </w:tcPr>
           <w:p>
             <w:pPr>
-              <w:spacing w:before="60" w:after="60"/>
+              <w:spacing w:before="40" w:after="40"/>
+              <w:jc w:val="center"/>
+            </w:pPr>
+            <w:r/>
+            <w:r>
+              <w:rPr>
+                <w:rFonts w:ascii="Calibri" w:hAnsi="Calibri"/>
+                <w:b w:val="0"/>
+                <w:sz w:val="18"/>
+              </w:rPr>
+              <w:t>§3</w:t>
+            </w:r>
+          </w:p>
+        </w:tc>
+        <w:tc>
+          <w:tcPr>
+            <w:tcW w:type="dxa" w:w="7710"/>
+            <w:vAlign w:val="center"/>
+          </w:tcPr>
+          <w:p>
+            <w:pPr>
+              <w:spacing w:before="40" w:after="40"/>
             </w:pPr>
             <w:r/>
             <w:r>
@@ -926,7 +1384,7 @@
                 <w:b w:val="0"/>
                 <w:sz w:val="20"/>
               </w:rPr>
-              <w:t>Autonomous detect/focus and track of a selected object</w:t>
+              <w:t>Video recording system compatible with all sensors installed, with sufficient power to maintain the geo point of each completed mission.</w:t>
             </w:r>
           </w:p>
         </w:tc>
@@ -937,7 +1395,7 @@
           </w:tcPr>
           <w:p>
             <w:pPr>
-              <w:spacing w:before="60" w:after="60"/>
+              <w:spacing w:before="40" w:after="40"/>
               <w:jc w:val="center"/>
             </w:pPr>
             <w:r/>
@@ -955,13 +1413,35 @@
       <w:tr>
         <w:tc>
           <w:tcPr>
-            <w:tcW w:type="dxa" w:w="8164"/>
+            <w:tcW w:type="dxa" w:w="907"/>
             <w:vAlign w:val="center"/>
             <w:shd w:fill="D6E3F0" w:val="clear"/>
           </w:tcPr>
           <w:p>
             <w:pPr>
-              <w:spacing w:before="60" w:after="60"/>
+              <w:spacing w:before="40" w:after="40"/>
+              <w:jc w:val="center"/>
+            </w:pPr>
+            <w:r/>
+            <w:r>
+              <w:rPr>
+                <w:rFonts w:ascii="Calibri" w:hAnsi="Calibri"/>
+                <w:b w:val="0"/>
+                <w:sz w:val="18"/>
+              </w:rPr>
+              <w:t>§3</w:t>
+            </w:r>
+          </w:p>
+        </w:tc>
+        <w:tc>
+          <w:tcPr>
+            <w:tcW w:type="dxa" w:w="7710"/>
+            <w:vAlign w:val="center"/>
+            <w:shd w:fill="D6E3F0" w:val="clear"/>
+          </w:tcPr>
+          <w:p>
+            <w:pPr>
+              <w:spacing w:before="40" w:after="40"/>
             </w:pPr>
             <w:r/>
             <w:r>
@@ -970,7 +1450,7 @@
                 <w:b w:val="0"/>
                 <w:sz w:val="20"/>
               </w:rPr>
-              <w:t>ADS-B (or equivalent) flight identification, unlockable, ≤0.1 kg</w:t>
+              <w:t>Geo track modes for EO/IR to display the observed target coordinates.</w:t>
             </w:r>
           </w:p>
         </w:tc>
@@ -982,7 +1462,7 @@
           </w:tcPr>
           <w:p>
             <w:pPr>
-              <w:spacing w:before="60" w:after="60"/>
+              <w:spacing w:before="40" w:after="40"/>
               <w:jc w:val="center"/>
             </w:pPr>
             <w:r/>
@@ -1000,12 +1480,33 @@
       <w:tr>
         <w:tc>
           <w:tcPr>
-            <w:tcW w:type="dxa" w:w="8164"/>
+            <w:tcW w:type="dxa" w:w="907"/>
             <w:vAlign w:val="center"/>
           </w:tcPr>
           <w:p>
             <w:pPr>
-              <w:spacing w:before="60" w:after="60"/>
+              <w:spacing w:before="40" w:after="40"/>
+              <w:jc w:val="center"/>
+            </w:pPr>
+            <w:r/>
+            <w:r>
+              <w:rPr>
+                <w:rFonts w:ascii="Calibri" w:hAnsi="Calibri"/>
+                <w:b w:val="0"/>
+                <w:sz w:val="18"/>
+              </w:rPr>
+              <w:t>§3</w:t>
+            </w:r>
+          </w:p>
+        </w:tc>
+        <w:tc>
+          <w:tcPr>
+            <w:tcW w:type="dxa" w:w="7710"/>
+            <w:vAlign w:val="center"/>
+          </w:tcPr>
+          <w:p>
+            <w:pPr>
+              <w:spacing w:before="40" w:after="40"/>
             </w:pPr>
             <w:r/>
             <w:r>
@@ -1014,7 +1515,7 @@
                 <w:b w:val="0"/>
                 <w:sz w:val="20"/>
               </w:rPr>
-              <w:t>Operator training on aircraft and/or simulator (up to 15 SBG officials); year-round simulator</w:t>
+              <w:t>Distance gauge is part of the geo point.</w:t>
             </w:r>
           </w:p>
         </w:tc>
@@ -1025,7 +1526,531 @@
           </w:tcPr>
           <w:p>
             <w:pPr>
-              <w:spacing w:before="60" w:after="60"/>
+              <w:spacing w:before="40" w:after="40"/>
+              <w:jc w:val="center"/>
+            </w:pPr>
+            <w:r/>
+            <w:r>
+              <w:rPr>
+                <w:rFonts w:ascii="Calibri" w:hAnsi="Calibri"/>
+                <w:b w:val="0"/>
+                <w:sz w:val="20"/>
+              </w:rPr>
+              <w:t>Latvia</w:t>
+            </w:r>
+          </w:p>
+        </w:tc>
+      </w:tr>
+      <w:tr>
+        <w:tc>
+          <w:tcPr>
+            <w:tcW w:type="dxa" w:w="907"/>
+            <w:vAlign w:val="center"/>
+            <w:shd w:fill="D6E3F0" w:val="clear"/>
+          </w:tcPr>
+          <w:p>
+            <w:pPr>
+              <w:spacing w:before="40" w:after="40"/>
+              <w:jc w:val="center"/>
+            </w:pPr>
+            <w:r/>
+            <w:r>
+              <w:rPr>
+                <w:rFonts w:ascii="Calibri" w:hAnsi="Calibri"/>
+                <w:b w:val="0"/>
+                <w:sz w:val="18"/>
+              </w:rPr>
+              <w:t>§3</w:t>
+            </w:r>
+          </w:p>
+        </w:tc>
+        <w:tc>
+          <w:tcPr>
+            <w:tcW w:type="dxa" w:w="7710"/>
+            <w:vAlign w:val="center"/>
+            <w:shd w:fill="D6E3F0" w:val="clear"/>
+          </w:tcPr>
+          <w:p>
+            <w:pPr>
+              <w:spacing w:before="40" w:after="40"/>
+            </w:pPr>
+            <w:r/>
+            <w:r>
+              <w:rPr>
+                <w:rFonts w:ascii="Calibri" w:hAnsi="Calibri"/>
+                <w:b w:val="0"/>
+                <w:sz w:val="20"/>
+              </w:rPr>
+              <w:t>Geo track subsystem capable of indicating the precise calculated distance to the observed target.</w:t>
+            </w:r>
+          </w:p>
+        </w:tc>
+        <w:tc>
+          <w:tcPr>
+            <w:tcW w:type="dxa" w:w="1701"/>
+            <w:vAlign w:val="center"/>
+            <w:shd w:fill="D6E3F0" w:val="clear"/>
+          </w:tcPr>
+          <w:p>
+            <w:pPr>
+              <w:spacing w:before="40" w:after="40"/>
+              <w:jc w:val="center"/>
+            </w:pPr>
+            <w:r/>
+            <w:r>
+              <w:rPr>
+                <w:rFonts w:ascii="Calibri" w:hAnsi="Calibri"/>
+                <w:b w:val="0"/>
+                <w:sz w:val="20"/>
+              </w:rPr>
+              <w:t>Latvia</w:t>
+            </w:r>
+          </w:p>
+        </w:tc>
+      </w:tr>
+      <w:tr>
+        <w:tc>
+          <w:tcPr>
+            <w:tcW w:type="dxa" w:w="907"/>
+            <w:vAlign w:val="center"/>
+          </w:tcPr>
+          <w:p>
+            <w:pPr>
+              <w:spacing w:before="40" w:after="40"/>
+              <w:jc w:val="center"/>
+            </w:pPr>
+            <w:r/>
+            <w:r>
+              <w:rPr>
+                <w:rFonts w:ascii="Calibri" w:hAnsi="Calibri"/>
+                <w:b w:val="0"/>
+                <w:sz w:val="18"/>
+              </w:rPr>
+              <w:t>§3</w:t>
+            </w:r>
+          </w:p>
+        </w:tc>
+        <w:tc>
+          <w:tcPr>
+            <w:tcW w:type="dxa" w:w="7710"/>
+            <w:vAlign w:val="center"/>
+          </w:tcPr>
+          <w:p>
+            <w:pPr>
+              <w:spacing w:before="40" w:after="40"/>
+            </w:pPr>
+            <w:r/>
+            <w:r>
+              <w:rPr>
+                <w:rFonts w:ascii="Calibri" w:hAnsi="Calibri"/>
+                <w:b w:val="0"/>
+                <w:sz w:val="20"/>
+              </w:rPr>
+              <w:t>Ability to focus on an object and track the object autonomously.</w:t>
+            </w:r>
+          </w:p>
+        </w:tc>
+        <w:tc>
+          <w:tcPr>
+            <w:tcW w:type="dxa" w:w="1701"/>
+            <w:vAlign w:val="center"/>
+          </w:tcPr>
+          <w:p>
+            <w:pPr>
+              <w:spacing w:before="40" w:after="40"/>
+              <w:jc w:val="center"/>
+            </w:pPr>
+            <w:r/>
+            <w:r>
+              <w:rPr>
+                <w:rFonts w:ascii="Calibri" w:hAnsi="Calibri"/>
+                <w:b w:val="0"/>
+                <w:sz w:val="20"/>
+              </w:rPr>
+              <w:t>Latvia</w:t>
+            </w:r>
+          </w:p>
+        </w:tc>
+      </w:tr>
+      <w:tr>
+        <w:tc>
+          <w:tcPr>
+            <w:tcW w:type="dxa" w:w="907"/>
+            <w:vAlign w:val="center"/>
+            <w:shd w:fill="D6E3F0" w:val="clear"/>
+          </w:tcPr>
+          <w:p>
+            <w:pPr>
+              <w:spacing w:before="40" w:after="40"/>
+              <w:jc w:val="center"/>
+            </w:pPr>
+            <w:r/>
+            <w:r>
+              <w:rPr>
+                <w:rFonts w:ascii="Calibri" w:hAnsi="Calibri"/>
+                <w:b w:val="0"/>
+                <w:sz w:val="18"/>
+              </w:rPr>
+              <w:t>§4</w:t>
+            </w:r>
+          </w:p>
+        </w:tc>
+        <w:tc>
+          <w:tcPr>
+            <w:tcW w:type="dxa" w:w="7710"/>
+            <w:vAlign w:val="center"/>
+            <w:shd w:fill="D6E3F0" w:val="clear"/>
+          </w:tcPr>
+          <w:p>
+            <w:pPr>
+              <w:spacing w:before="40" w:after="40"/>
+            </w:pPr>
+            <w:r/>
+            <w:r>
+              <w:rPr>
+                <w:rFonts w:ascii="Calibri" w:hAnsi="Calibri"/>
+                <w:b w:val="0"/>
+                <w:sz w:val="20"/>
+              </w:rPr>
+              <w:t>GCS with flight path tracking antenna system used in performance of SBG mobile vehicle or ship, SBG tasks, FRONTEX tasks, and other State and local government tasks.</w:t>
+            </w:r>
+          </w:p>
+        </w:tc>
+        <w:tc>
+          <w:tcPr>
+            <w:tcW w:type="dxa" w:w="1701"/>
+            <w:vAlign w:val="center"/>
+            <w:shd w:fill="D6E3F0" w:val="clear"/>
+          </w:tcPr>
+          <w:p>
+            <w:pPr>
+              <w:spacing w:before="40" w:after="40"/>
+              <w:jc w:val="center"/>
+            </w:pPr>
+            <w:r/>
+            <w:r>
+              <w:rPr>
+                <w:rFonts w:ascii="Calibri" w:hAnsi="Calibri"/>
+                <w:b w:val="0"/>
+                <w:sz w:val="20"/>
+              </w:rPr>
+              <w:t>Latvia</w:t>
+            </w:r>
+          </w:p>
+        </w:tc>
+      </w:tr>
+      <w:tr>
+        <w:tc>
+          <w:tcPr>
+            <w:tcW w:type="dxa" w:w="907"/>
+            <w:vAlign w:val="center"/>
+          </w:tcPr>
+          <w:p>
+            <w:pPr>
+              <w:spacing w:before="40" w:after="40"/>
+              <w:jc w:val="center"/>
+            </w:pPr>
+            <w:r/>
+            <w:r>
+              <w:rPr>
+                <w:rFonts w:ascii="Calibri" w:hAnsi="Calibri"/>
+                <w:b w:val="0"/>
+                <w:sz w:val="18"/>
+              </w:rPr>
+              <w:t>§4</w:t>
+            </w:r>
+          </w:p>
+        </w:tc>
+        <w:tc>
+          <w:tcPr>
+            <w:tcW w:type="dxa" w:w="7710"/>
+            <w:vAlign w:val="center"/>
+          </w:tcPr>
+          <w:p>
+            <w:pPr>
+              <w:spacing w:before="40" w:after="40"/>
+            </w:pPr>
+            <w:r/>
+            <w:r>
+              <w:rPr>
+                <w:rFonts w:ascii="Calibri" w:hAnsi="Calibri"/>
+                <w:b w:val="0"/>
+                <w:sz w:val="20"/>
+              </w:rPr>
+              <w:t>GCS has capability of aircraft handing-over among GCSs.</w:t>
+            </w:r>
+          </w:p>
+        </w:tc>
+        <w:tc>
+          <w:tcPr>
+            <w:tcW w:type="dxa" w:w="1701"/>
+            <w:vAlign w:val="center"/>
+          </w:tcPr>
+          <w:p>
+            <w:pPr>
+              <w:spacing w:before="40" w:after="40"/>
+              <w:jc w:val="center"/>
+            </w:pPr>
+            <w:r/>
+            <w:r>
+              <w:rPr>
+                <w:rFonts w:ascii="Calibri" w:hAnsi="Calibri"/>
+                <w:b w:val="0"/>
+                <w:sz w:val="20"/>
+              </w:rPr>
+              <w:t>Latvia</w:t>
+            </w:r>
+          </w:p>
+        </w:tc>
+      </w:tr>
+      <w:tr>
+        <w:tc>
+          <w:tcPr>
+            <w:tcW w:type="dxa" w:w="907"/>
+            <w:vAlign w:val="center"/>
+            <w:shd w:fill="D6E3F0" w:val="clear"/>
+          </w:tcPr>
+          <w:p>
+            <w:pPr>
+              <w:spacing w:before="40" w:after="40"/>
+              <w:jc w:val="center"/>
+            </w:pPr>
+            <w:r/>
+            <w:r>
+              <w:rPr>
+                <w:rFonts w:ascii="Calibri" w:hAnsi="Calibri"/>
+                <w:b w:val="0"/>
+                <w:sz w:val="18"/>
+              </w:rPr>
+              <w:t>§4</w:t>
+            </w:r>
+          </w:p>
+        </w:tc>
+        <w:tc>
+          <w:tcPr>
+            <w:tcW w:type="dxa" w:w="7710"/>
+            <w:vAlign w:val="center"/>
+            <w:shd w:fill="D6E3F0" w:val="clear"/>
+          </w:tcPr>
+          <w:p>
+            <w:pPr>
+              <w:spacing w:before="40" w:after="40"/>
+            </w:pPr>
+            <w:r/>
+            <w:r>
+              <w:rPr>
+                <w:rFonts w:ascii="Calibri" w:hAnsi="Calibri"/>
+                <w:b w:val="0"/>
+                <w:sz w:val="20"/>
+              </w:rPr>
+              <w:t>Unmanned aircraft systems for the deployment and functionality of control and communication elements during their operation.</w:t>
+            </w:r>
+          </w:p>
+        </w:tc>
+        <w:tc>
+          <w:tcPr>
+            <w:tcW w:type="dxa" w:w="1701"/>
+            <w:vAlign w:val="center"/>
+            <w:shd w:fill="D6E3F0" w:val="clear"/>
+          </w:tcPr>
+          <w:p>
+            <w:pPr>
+              <w:spacing w:before="40" w:after="40"/>
+              <w:jc w:val="center"/>
+            </w:pPr>
+            <w:r/>
+            <w:r>
+              <w:rPr>
+                <w:rFonts w:ascii="Calibri" w:hAnsi="Calibri"/>
+                <w:b w:val="0"/>
+                <w:sz w:val="20"/>
+              </w:rPr>
+              <w:t>Latvia</w:t>
+            </w:r>
+          </w:p>
+        </w:tc>
+      </w:tr>
+      <w:tr>
+        <w:tc>
+          <w:tcPr>
+            <w:tcW w:type="dxa" w:w="907"/>
+            <w:vAlign w:val="center"/>
+          </w:tcPr>
+          <w:p>
+            <w:pPr>
+              <w:spacing w:before="40" w:after="40"/>
+              <w:jc w:val="center"/>
+            </w:pPr>
+            <w:r/>
+            <w:r>
+              <w:rPr>
+                <w:rFonts w:ascii="Calibri" w:hAnsi="Calibri"/>
+                <w:b w:val="0"/>
+                <w:sz w:val="18"/>
+              </w:rPr>
+              <w:t>§4</w:t>
+            </w:r>
+          </w:p>
+        </w:tc>
+        <w:tc>
+          <w:tcPr>
+            <w:tcW w:type="dxa" w:w="7710"/>
+            <w:vAlign w:val="center"/>
+          </w:tcPr>
+          <w:p>
+            <w:pPr>
+              <w:spacing w:before="40" w:after="40"/>
+            </w:pPr>
+            <w:r/>
+            <w:r>
+              <w:rPr>
+                <w:rFonts w:ascii="Calibri" w:hAnsi="Calibri"/>
+                <w:b w:val="0"/>
+                <w:sz w:val="20"/>
+              </w:rPr>
+              <w:t>Stable and high-quality data transmission at distance that is not less than 80 km (tender offer: up to 100 km).</w:t>
+            </w:r>
+          </w:p>
+        </w:tc>
+        <w:tc>
+          <w:tcPr>
+            <w:tcW w:type="dxa" w:w="1701"/>
+            <w:vAlign w:val="center"/>
+          </w:tcPr>
+          <w:p>
+            <w:pPr>
+              <w:spacing w:before="40" w:after="40"/>
+              <w:jc w:val="center"/>
+            </w:pPr>
+            <w:r/>
+            <w:r>
+              <w:rPr>
+                <w:rFonts w:ascii="Calibri" w:hAnsi="Calibri"/>
+                <w:b w:val="0"/>
+                <w:sz w:val="20"/>
+              </w:rPr>
+              <w:t>Latvia</w:t>
+            </w:r>
+          </w:p>
+        </w:tc>
+      </w:tr>
+      <w:tr>
+        <w:tc>
+          <w:tcPr>
+            <w:tcW w:type="dxa" w:w="907"/>
+            <w:vAlign w:val="center"/>
+            <w:shd w:fill="D6E3F0" w:val="clear"/>
+          </w:tcPr>
+          <w:p>
+            <w:pPr>
+              <w:spacing w:before="40" w:after="40"/>
+              <w:jc w:val="center"/>
+            </w:pPr>
+            <w:r/>
+            <w:r>
+              <w:rPr>
+                <w:rFonts w:ascii="Calibri" w:hAnsi="Calibri"/>
+                <w:b w:val="0"/>
+                <w:sz w:val="18"/>
+              </w:rPr>
+              <w:t>§6</w:t>
+            </w:r>
+          </w:p>
+        </w:tc>
+        <w:tc>
+          <w:tcPr>
+            <w:tcW w:type="dxa" w:w="7710"/>
+            <w:vAlign w:val="center"/>
+            <w:shd w:fill="D6E3F0" w:val="clear"/>
+          </w:tcPr>
+          <w:p>
+            <w:pPr>
+              <w:spacing w:before="40" w:after="40"/>
+            </w:pPr>
+            <w:r/>
+            <w:r>
+              <w:rPr>
+                <w:rFonts w:ascii="Calibri" w:hAnsi="Calibri"/>
+                <w:b w:val="0"/>
+                <w:sz w:val="20"/>
+              </w:rPr>
+              <w:t>Training of State Border Guard officials on the system or on a simulator (or in the system and simulator) so each trained official is able to independently pilot, operate, and service the unmanned aircraft system. Planned number: up to 15 individuals.</w:t>
+            </w:r>
+          </w:p>
+        </w:tc>
+        <w:tc>
+          <w:tcPr>
+            <w:tcW w:type="dxa" w:w="1701"/>
+            <w:vAlign w:val="center"/>
+            <w:shd w:fill="D6E3F0" w:val="clear"/>
+          </w:tcPr>
+          <w:p>
+            <w:pPr>
+              <w:spacing w:before="40" w:after="40"/>
+              <w:jc w:val="center"/>
+            </w:pPr>
+            <w:r/>
+            <w:r>
+              <w:rPr>
+                <w:rFonts w:ascii="Calibri" w:hAnsi="Calibri"/>
+                <w:b w:val="0"/>
+                <w:sz w:val="20"/>
+              </w:rPr>
+              <w:t>Latvia</w:t>
+            </w:r>
+          </w:p>
+        </w:tc>
+      </w:tr>
+      <w:tr>
+        <w:tc>
+          <w:tcPr>
+            <w:tcW w:type="dxa" w:w="907"/>
+            <w:vAlign w:val="center"/>
+          </w:tcPr>
+          <w:p>
+            <w:pPr>
+              <w:spacing w:before="40" w:after="40"/>
+              <w:jc w:val="center"/>
+            </w:pPr>
+            <w:r/>
+            <w:r>
+              <w:rPr>
+                <w:rFonts w:ascii="Calibri" w:hAnsi="Calibri"/>
+                <w:b w:val="0"/>
+                <w:sz w:val="18"/>
+              </w:rPr>
+              <w:t>§6</w:t>
+            </w:r>
+          </w:p>
+        </w:tc>
+        <w:tc>
+          <w:tcPr>
+            <w:tcW w:type="dxa" w:w="7710"/>
+            <w:vAlign w:val="center"/>
+          </w:tcPr>
+          <w:p>
+            <w:pPr>
+              <w:spacing w:before="40" w:after="40"/>
+            </w:pPr>
+            <w:r/>
+            <w:r>
+              <w:rPr>
+                <w:rFonts w:ascii="Calibri" w:hAnsi="Calibri"/>
+                <w:b w:val="0"/>
+                <w:sz w:val="20"/>
+              </w:rPr>
+              <w:t>Complete simulator system provided with the aircraft, allowing year-round training.</w:t>
+            </w:r>
+          </w:p>
+        </w:tc>
+        <w:tc>
+          <w:tcPr>
+            <w:tcW w:type="dxa" w:w="1701"/>
+            <w:vAlign w:val="center"/>
+          </w:tcPr>
+          <w:p>
+            <w:pPr>
+              <w:spacing w:before="40" w:after="40"/>
               <w:jc w:val="center"/>
             </w:pPr>
             <w:r/>
@@ -1043,7 +2068,7 @@
     </w:tbl>
     <w:sectPr>
       <w:pgSz w:w="11906" w:h="16838"/>
-      <w:pgMar w:top="1020" w:right="1020" w:bottom="1020" w:left="1020" w:header="720" w:footer="720" w:gutter="0"/>
+      <w:pgMar w:top="907" w:right="907" w:bottom="907" w:left="907" w:header="720" w:footer="720" w:gutter="0"/>
       <w:cols w:space="720"/>
       <w:docGrid w:linePitch="360"/>
     </w:sectPr>
@@ -1415,7 +2440,7 @@
     <w:qFormat/>
     <w:rsid w:val="00FC693F"/>
     <w:rPr>
-      <w:rFonts w:ascii="Calibri" w:hAnsi="Calibri" w:eastAsia="Calibri"/>
+      <w:rFonts w:ascii="Calibri" w:hAnsi="Calibri"/>
       <w:sz w:val="22"/>
     </w:rPr>
   </w:style>

</xml_diff>